<commit_message>
S105: identity separation in the tree - partner references pseudonymised, lessons-learned ids renumbered into GNI-L (history untouched)
</commit_message>
<xml_diff>
--- a/GNI_S29_Session_Audit.docx
+++ b/GNI_S29_Session_Audit.docx
@@ -386,7 +386,7 @@
                 <w:sz w:val="18"/>
                 <w:szCs w:val="18"/>
               </w:rPr>
-              <w:t xml:space="preserve">~6 hours (continuing from S28+LENS-005 marathon)</w:t>
+              <w:t xml:space="preserve">~6 hours (continuing from S28+Partner B marathon)</w:t>
             </w:r>
           </w:p>
         </w:tc>
@@ -4760,7 +4760,7 @@
           <w:sz w:val="20"/>
           <w:szCs w:val="20"/>
         </w:rPr>
-        <w:t xml:space="preserve">6. New sources (Reuters+AP via Google News) — direct feeds blocked since 2020/2026. Google News RSS workaround is the standard approach. LR-014(E) compliant. Pattern: https://news.google.com/rss/search?q=when:24h+allinurl:reuters.com&amp;ceid=US:en&amp;hl=en-US&amp;gl=US</w:t>
+        <w:t xml:space="preserve">6. New sources (Reuters+AP via Google News) — direct feeds blocked since 2020/2026. Google News RSS workaround is the standard approach. GNI-L-014(E) compliant. Pattern: https://news.google.com/rss/search?q=when:24h+allinurl:reuters.com&amp;ceid=US:en&amp;hl=en-US&amp;gl=US</w:t>
       </w:r>
     </w:p>
     <w:p>

</xml_diff>